<commit_message>
Spritn 2 - Sección 1
</commit_message>
<xml_diff>
--- a/data/ejemplo.docx
+++ b/data/ejemplo.docx
@@ -4,7 +4,13 @@
   <w:body>
     <w:p>
       <w:r>
-        <w:t>Persona: Paco Pérez.</w:t>
+        <w:t>Nombre</w:t>
+      </w:r>
+      <w:r>
+        <w:t xml:space="preserve">: </w:t>
+      </w:r>
+      <w:r>
+        <w:t>María García</w:t>
       </w:r>
     </w:p>
     <w:p>
@@ -14,7 +20,21 @@
     </w:p>
     <w:p>
       <w:r>
-        <w:t>Destino: Murcia.</w:t>
+        <w:t>Destino:</w:t>
+      </w:r>
+      <w:r>
+        <w:t xml:space="preserve"> Madrid (España)</w:t>
+      </w:r>
+      <w:r>
+        <w:t>.</w:t>
+      </w:r>
+    </w:p>
+    <w:p>
+      <w:r>
+        <w:t xml:space="preserve">Universidad: </w:t>
+      </w:r>
+      <w:r>
+        <w:t>Universidad Autónoma de Madrid (UAM)</w:t>
       </w:r>
     </w:p>
     <w:p>
@@ -646,7 +666,6 @@
   <w:style w:type="character" w:default="1" w:styleId="Fuentedeprrafopredeter">
     <w:name w:val="Default Paragraph Font"/>
     <w:uiPriority w:val="1"/>
-    <w:semiHidden/>
     <w:unhideWhenUsed/>
   </w:style>
   <w:style w:type="table" w:default="1" w:styleId="Tablanormal">

</xml_diff>